<commit_message>
Fix K250Q wording and NMD distance
</commit_message>
<xml_diff>
--- a/TRACK2_LAY_REPORT.docx
+++ b/TRACK2_LAY_REPORT.docx
@@ -2,40 +2,6 @@
 <file path=word/document.xml><?xml version="1.0" encoding="utf-8"?>
 <w:document xmlns:w="http://schemas.openxmlformats.org/wordprocessingml/2006/main" xmlns:m="http://schemas.openxmlformats.org/officeDocument/2006/math" xmlns:r="http://schemas.openxmlformats.org/officeDocument/2006/relationships" xmlns:o="urn:schemas-microsoft-com:office:office" xmlns:v="urn:schemas-microsoft-com:vml" xmlns:w10="urn:schemas-microsoft-com:office:word" xmlns:a="http://schemas.openxmlformats.org/drawingml/2006/main" xmlns:pic="http://schemas.openxmlformats.org/drawingml/2006/picture" xmlns:wp="http://schemas.openxmlformats.org/drawingml/2006/wordprocessingDrawing">
   <w:body>
-    <w:p>
-      <w:pPr>
-        <w:pStyle w:val="Title"/>
-      </w:pPr>
-      <w:r>
-        <w:t xml:space="preserve">MVA Track-2 Lay Report</w:t>
-      </w:r>
-    </w:p>
-    <w:sdt>
-      <w:sdtPr>
-        <w:docPartObj>
-          <w:docPartGallery w:val="Table of Contents"/>
-          <w:docPartUnique/>
-        </w:docPartObj>
-      </w:sdtPr>
-      <w:sdtContent>
-        <w:p>
-          <w:pPr>
-            <w:pStyle w:val="TOCHeading"/>
-          </w:pPr>
-          <w:r>
-            <w:t xml:space="preserve">Table of Contents</w:t>
-          </w:r>
-        </w:p>
-        <w:p>
-          <w:r>
-            <w:fldChar w:fldCharType="begin" w:dirty="true"/>
-            <w:instrText xml:space="preserve">TOC \o "1-3" \h \z \u</w:instrText>
-            <w:fldChar w:fldCharType="separate"/>
-            <w:fldChar w:fldCharType="end"/>
-          </w:r>
-        </w:p>
-      </w:sdtContent>
-    </w:sdt>
     <w:bookmarkStart w:id="56" w:name="Xa69ee110fbb147ce08efd5b1cb10bee5a1ea1ea"/>
     <w:p>
       <w:pPr>
@@ -1344,13 +1310,13 @@
         <w:t xml:space="preserve"> </w:t>
       </w:r>
       <w:r>
-        <w:t xml:space="preserve">measurements in patient-derived cells have shown that the checkpoint works almost normally</w:t>
-      </w:r>
-      <w:r>
-        <w:t xml:space="preserve"> </w:t>
-      </w:r>
-      <w:r>
-        <w:t xml:space="preserve">when a person has roughly ~13% of the normal BubR1 level, and fails badly at ~6% [E04].</w:t>
+        <w:t xml:space="preserve">measurements taken inside one laboratory’s titration experiment on cancer cells showed the checkpoint still worked almost normally</w:t>
+      </w:r>
+      <w:r>
+        <w:t xml:space="preserve"> </w:t>
+      </w:r>
+      <w:r>
+        <w:t xml:space="preserve">when the cells were dialled down to ~13% of their normal BubR1 level, and mis-segregated badly at ~6% [E04]. In this child’s own patient-derived cells the same study measured just a 2-to-6-fold reduction of the mutant protein - a fold number, never a percentage of normal. So the titration numbers are a laboratory comparison, not a medical threshold for this child.</w:t>
       </w:r>
       <w:r>
         <w:t xml:space="preserve"> </w:t>
@@ -1689,6 +1655,111 @@
       </w:r>
       <w:r>
         <w:t xml:space="preserve">adversarial-review memos, and 19 research memos with recorded search logs).</w:t>
+      </w:r>
+    </w:p>
+    <w:p>
+      <w:pPr>
+        <w:pStyle w:val="BodyText"/>
+      </w:pPr>
+      <w:r>
+        <w:rPr>
+          <w:bCs/>
+          <w:b/>
+        </w:rPr>
+        <w:t xml:space="preserve">One extra check that is not yet in the official guidance, and why it is missing.</w:t>
+      </w:r>
+      <w:r>
+        <w:t xml:space="preserve"> </w:t>
+      </w:r>
+      <w:r>
+        <w:t xml:space="preserve">Two further</w:t>
+      </w:r>
+      <w:r>
+        <w:t xml:space="preserve"> </w:t>
+      </w:r>
+      <w:r>
+        <w:t xml:space="preserve">sources written for this condition both add a</w:t>
+      </w:r>
+      <w:r>
+        <w:t xml:space="preserve"> </w:t>
+      </w:r>
+      <w:r>
+        <w:rPr>
+          <w:bCs/>
+          <w:b/>
+        </w:rPr>
+        <w:t xml:space="preserve">blood test every three months, to look for</w:t>
+      </w:r>
+      <w:r>
+        <w:rPr>
+          <w:bCs/>
+          <w:b/>
+        </w:rPr>
+        <w:t xml:space="preserve"> </w:t>
+      </w:r>
+      <w:r>
+        <w:rPr>
+          <w:bCs/>
+          <w:b/>
+        </w:rPr>
+        <w:t xml:space="preserve">leukaemia</w:t>
+      </w:r>
+      <w:r>
+        <w:t xml:space="preserve">, alongside the kidney ultrasound: a 2026 guide written for this exact gene by the MVA</w:t>
+      </w:r>
+      <w:r>
+        <w:t xml:space="preserve"> </w:t>
+      </w:r>
+      <w:r>
+        <w:t xml:space="preserve">Society with Unique and reviewed by a consultant geneticist [E73], and Japan’s national handbook for</w:t>
+      </w:r>
+      <w:r>
+        <w:t xml:space="preserve"> </w:t>
+      </w:r>
+      <w:r>
+        <w:t xml:space="preserve">this syndrome, which schedules a blood count at every visit from three months of age onwards [E74].</w:t>
+      </w:r>
+      <w:r>
+        <w:t xml:space="preserve"> </w:t>
+      </w:r>
+      <w:r>
+        <w:t xml:space="preserve">The reason it is absent from the main guidance is specific. The companion guideline covering blood</w:t>
+      </w:r>
+      <w:r>
+        <w:t xml:space="preserve"> </w:t>
+      </w:r>
+      <w:r>
+        <w:t xml:space="preserve">cancers in children with a genetic predisposition does not mention this syndrome, or any of its</w:t>
+      </w:r>
+      <w:r>
+        <w:t xml:space="preserve"> </w:t>
+      </w:r>
+      <w:r>
+        <w:t xml:space="preserve">genes, anywhere in its text [E75]. Set against that, one child with this condition did develop a</w:t>
+      </w:r>
+      <w:r>
+        <w:t xml:space="preserve"> </w:t>
+      </w:r>
+      <w:r>
+        <w:t xml:space="preserve">bone-marrow disorder and died after a transplant [E76]. We are not making this a recommendation:</w:t>
+      </w:r>
+      <w:r>
+        <w:t xml:space="preserve"> </w:t>
+      </w:r>
+      <w:r>
+        <w:t xml:space="preserve">the sources are a family guide and a national handbook rather than a formal guideline, and the</w:t>
+      </w:r>
+      <w:r>
+        <w:t xml:space="preserve"> </w:t>
+      </w:r>
+      <w:r>
+        <w:t xml:space="preserve">marrow evidence is a single case. We report it because a three-monthly blood test is cheap and</w:t>
+      </w:r>
+      <w:r>
+        <w:t xml:space="preserve"> </w:t>
+      </w:r>
+      <w:r>
+        <w:t xml:space="preserve">low-risk, and because a family should be able to raise it with their team and ask whether it fits.</w:t>
       </w:r>
     </w:p>
     <w:p>
@@ -3094,37 +3165,43 @@
         <w:t xml:space="preserve"> </w:t>
       </w:r>
       <w:r>
-        <w:t xml:space="preserve">Skipping block 17 removes the 46 building</w:t>
-      </w:r>
-      <w:r>
-        <w:t xml:space="preserve"> </w:t>
-      </w:r>
-      <w:r>
-        <w:t xml:space="preserve">blocks it encodes (the chain from position 716 through 761) and changes one neighbor</w:t>
-      </w:r>
-      <w:r>
-        <w:t xml:space="preserve"> </w:t>
-      </w:r>
-      <w:r>
-        <w:t xml:space="preserve">(position 715) - in scientific shorthand</w:t>
-      </w:r>
-      <w:r>
-        <w:t xml:space="preserve"> </w:t>
-      </w:r>
-      <w:r>
-        <w:t xml:space="preserve">“</w:t>
-      </w:r>
-      <w:r>
-        <w:t xml:space="preserve">Δ716-761 + E715G</w:t>
-      </w:r>
-      <w:r>
-        <w:t xml:space="preserve">”</w:t>
-      </w:r>
-      <w:r>
-        <w:t xml:space="preserve"> </w:t>
-      </w:r>
-      <w:r>
-        <w:t xml:space="preserve">[E42]. No one has tested</w:t>
+        <w:t xml:space="preserve">Skipping block 17 shortens the protein by</w:t>
+      </w:r>
+      <w:r>
+        <w:t xml:space="preserve"> </w:t>
+      </w:r>
+      <w:r>
+        <w:t xml:space="preserve">47 building blocks (positions 716 through 762) and re-encodes one neighbor (in scientific</w:t>
+      </w:r>
+      <w:r>
+        <w:t xml:space="preserve"> </w:t>
+      </w:r>
+      <w:r>
+        <w:t xml:space="preserve">shorthand, p.Glu715_Gly762delinsGly - we rebuilt this from the exact reference transcript and</w:t>
+      </w:r>
+      <w:r>
+        <w:t xml:space="preserve"> </w:t>
+      </w:r>
+      <w:r>
+        <w:t xml:space="preserve">verified it with a reproducible script: the 141 missing nucleotides correspond to 46 complete</w:t>
+      </w:r>
+      <w:r>
+        <w:t xml:space="preserve"> </w:t>
+      </w:r>
+      <w:r>
+        <w:t xml:space="preserve">interior code-words plus two boundary code-words, and the boundary nearest the gene’s start is</w:t>
+      </w:r>
+      <w:r>
+        <w:t xml:space="preserve"> </w:t>
+      </w:r>
+      <w:r>
+        <w:t xml:space="preserve">re-encoded glycine; what exactly is lost cannot be read off from dividing 141 by 3 alone -</w:t>
+      </w:r>
+      <w:r>
+        <w:t xml:space="preserve"> </w:t>
+      </w:r>
+      <w:r>
+        <w:t xml:space="preserve">it has to come from the real sequence) [E42]. No one has tested</w:t>
       </w:r>
       <w:r>
         <w:t xml:space="preserve"> </w:t>
@@ -3177,13 +3254,19 @@
         <w:t xml:space="preserve"> </w:t>
       </w:r>
       <w:r>
-        <w:t xml:space="preserve">protein works, benefit lands at ~16–22 % of normal levels - an estimate, not a measurement -</w:t>
-      </w:r>
-      <w:r>
-        <w:t xml:space="preserve"> </w:t>
-      </w:r>
-      <w:r>
-        <w:t xml:space="preserve">above the ~13 % competence line; and if it doesn’t, the patch would break the remaining</w:t>
+        <w:t xml:space="preserve">protein works, benefit lands at ~16-22 % of normal levels - an assumption-dependent estimate,</w:t>
+      </w:r>
+      <w:r>
+        <w:t xml:space="preserve"> </w:t>
+      </w:r>
+      <w:r>
+        <w:t xml:space="preserve">not a measurement, and judged against a laboratory titration number only because nothing better</w:t>
+      </w:r>
+      <w:r>
+        <w:t xml:space="preserve"> </w:t>
+      </w:r>
+      <w:r>
+        <w:t xml:space="preserve">exists yet; and if it doesn’t, the patch would break the remaining</w:t>
       </w:r>
       <w:r>
         <w:t xml:space="preserve"> </w:t>
@@ -4159,7 +4242,7 @@
         <w:t xml:space="preserve">★ The decisive experiment</w:t>
       </w:r>
       <w:r>
-        <w:t xml:space="preserve">: build the Δ716-761+E715G patched protein and test</w:t>
+        <w:t xml:space="preserve">: build the Δ716-762(+E715G) patched protein and test</w:t>
       </w:r>
       <w:r>
         <w:t xml:space="preserve"> </w:t>
@@ -4234,24 +4317,13 @@
           <w:bCs/>
           <w:b/>
         </w:rPr>
-        <w:t xml:space="preserve">Checkpoint-timing test of where the child actually sits on the 6 → 13 % competence</w:t>
-      </w:r>
-      <w:r>
-        <w:rPr>
-          <w:bCs/>
-          <w:b/>
-        </w:rPr>
-        <w:t xml:space="preserve"> </w:t>
-      </w:r>
-      <w:r>
-        <w:rPr>
-          <w:bCs/>
-          <w:b/>
-        </w:rPr>
-        <w:t xml:space="preserve">curve</w:t>
-      </w:r>
-      <w:r>
-        <w:t xml:space="preserve">: a standard live-cell test that measures how long the checkpoint holds before</w:t>
+        <w:t xml:space="preserve">Checkpoint-timing test of where the child actually sits relative to the laboratory dose-response</w:t>
+      </w:r>
+      <w:r>
+        <w:t xml:space="preserve"> </w:t>
+      </w:r>
+      <w:r>
+        <w:t xml:space="preserve">curve**: a standard live-cell test that measures how long the checkpoint holds before</w:t>
       </w:r>
       <w:r>
         <w:t xml:space="preserve"> </w:t>
@@ -4688,7 +4760,7 @@
         <w:t xml:space="preserve"> </w:t>
       </w:r>
       <w:r>
-        <w:t xml:space="preserve">- Δ716-761+E715G function:</w:t>
+        <w:t xml:space="preserve">- Δ716-762(+E715G) function:</w:t>
       </w:r>
       <w:r>
         <w:t xml:space="preserve"> </w:t>
@@ -4786,7 +4858,7 @@
           <w:rPr>
             <w:rStyle w:val="Hyperlink"/>
           </w:rPr>
-          <w:t xml:space="preserve">figures/F1_N1002K_structure.png</w:t>
+          <w:t xml:space="preserve">figures/F1_variant_structure.png</w:t>
         </w:r>
       </w:hyperlink>
     </w:p>
@@ -4988,7 +5060,7 @@
               <a:graphicData uri="http://schemas.openxmlformats.org/drawingml/2006/picture">
                 <pic:pic>
                   <pic:nvPicPr>
-                    <pic:cNvPr descr="figures/F1_N1002K_structure.png" id="48" name="Picture"/>
+                    <pic:cNvPr descr="figures/F1_variant_structure.png" id="48" name="Picture"/>
                     <pic:cNvPicPr>
                       <a:picLocks noChangeArrowheads="1" noChangeAspect="1"/>
                     </pic:cNvPicPr>
@@ -5458,7 +5530,7 @@
         <w:t xml:space="preserve"> </w:t>
       </w:r>
       <w:r>
-        <w:t xml:space="preserve">Suijkerbuijk et al. 2010 - patient-cell checkpoint dose-response (~13 % competent</w:t>
+        <w:t xml:space="preserve">Suijkerbuijk et al. 2010 - cellular dose-response in HeLa knockdown titration (~13 % intact</w:t>
       </w:r>
       <w:r>
         <w:t xml:space="preserve"> </w:t>
@@ -6579,13 +6651,35 @@
         <w:t xml:space="preserve"> </w:t>
       </w:r>
       <w:r>
-        <w:t xml:space="preserve">adverse datum (early termination for peripheral neuropathy, 85.7 % -</w:t>
-      </w:r>
-      <w:r>
-        <w:t xml:space="preserve"> </w:t>
-      </w:r>
-      <w:r>
-        <w:t xml:space="preserve">https://doi.org/10.1038/s41591-025-04117-4).</w:t>
+        <w:t xml:space="preserve">adverse datum:</w:t>
+      </w:r>
+      <w:r>
+        <w:t xml:space="preserve"> </w:t>
+      </w:r>
+      <w:r>
+        <w:rPr>
+          <w:iCs/>
+          <w:i/>
+        </w:rPr>
+        <w:t xml:space="preserve">Nat Med</w:t>
+      </w:r>
+      <w:r>
+        <w:t xml:space="preserve"> </w:t>
+      </w:r>
+      <w:r>
+        <w:t xml:space="preserve">2026 reports the branaplam VIBRANT-HD study (adult Huntington’s</w:t>
+      </w:r>
+      <w:r>
+        <w:t xml:space="preserve"> </w:t>
+      </w:r>
+      <w:r>
+        <w:t xml:space="preserve">disease, not a pediatric trial) terminated after peripheral neuropathy in 18 of 21</w:t>
+      </w:r>
+      <w:r>
+        <w:t xml:space="preserve"> </w:t>
+      </w:r>
+      <w:r>
+        <w:t xml:space="preserve">treated participants (85.7 %); https://doi.org/10.1038/s41591-025-04117-4).</w:t>
       </w:r>
     </w:p>
     <w:p>
@@ -7561,159 +7655,476 @@
         <w:t xml:space="preserve"> </w:t>
       </w:r>
       <w:r>
-        <w:t xml:space="preserve">evidence/WORKFLOW_CONSENSUS.md (+ adversarial pass memos wave2/3/4/5_ADVERSARIAL*.md):</w:t>
-      </w:r>
-      <w:r>
-        <w:t xml:space="preserve"> </w:t>
-      </w:r>
-      <w:r>
+        <w:t xml:space="preserve">evidence/WORKFLOW_CONSENSUS.md (+ adversarial pass memos wave2/3/4/5_ADVERSARIAL</w:t>
+      </w:r>
+      <w:r>
+        <w:rPr>
+          <w:iCs/>
+          <w:i/>
+        </w:rPr>
+        <w:t xml:space="preserve">.md):</w:t>
+      </w:r>
+      <w:r>
+        <w:rPr>
+          <w:iCs/>
+          <w:i/>
+        </w:rPr>
+        <w:t xml:space="preserve"> </w:t>
+      </w:r>
+      <w:r>
+        <w:rPr>
+          <w:iCs/>
+          <w:i/>
+        </w:rPr>
         <w:t xml:space="preserve">3 waves, 19 memos, decay 8→2→2→0, 90/90 identifiers registry-verified (32+34+24 across the waves); P2/P3/PR fix tags, PR = lay-report review fixes.</w:t>
       </w:r>
       <w:r>
-        <w:t xml:space="preserve"> </w:t>
-      </w:r>
-      <w:r>
+        <w:rPr>
+          <w:iCs/>
+          <w:i/>
+        </w:rPr>
+        <w:t xml:space="preserve"> </w:t>
+      </w:r>
+      <w:r>
+        <w:rPr>
+          <w:iCs/>
+          <w:i/>
+        </w:rPr>
         <w:t xml:space="preserve">-</w:t>
       </w:r>
       <w:r>
-        <w:t xml:space="preserve"> </w:t>
-      </w:r>
-      <w:r>
-        <w:rPr>
-          <w:bCs/>
-          <w:b/>
+        <w:rPr>
+          <w:iCs/>
+          <w:i/>
+        </w:rPr>
+        <w:t xml:space="preserve"> </w:t>
+      </w:r>
+      <w:r>
+        <w:rPr>
+          <w:bCs/>
+          <w:b/>
+          <w:iCs/>
+          <w:i/>
         </w:rPr>
         <w:t xml:space="preserve">E40-P2</w:t>
       </w:r>
       <w:r>
-        <w:t xml:space="preserve"> </w:t>
-      </w:r>
-      <w:r>
+        <w:rPr>
+          <w:iCs/>
+          <w:i/>
+        </w:rPr>
+        <w:t xml:space="preserve"> </w:t>
+      </w:r>
+      <w:r>
+        <w:rPr>
+          <w:iCs/>
+          <w:i/>
+        </w:rPr>
         <w:t xml:space="preserve">wave2_ADVERSARIAL_REVIEW.md - the allele-non-specificity analysis + KARD</w:t>
       </w:r>
       <w:r>
-        <w:t xml:space="preserve"> </w:t>
-      </w:r>
-      <w:r>
+        <w:rPr>
+          <w:iCs/>
+          <w:i/>
+        </w:rPr>
+        <w:t xml:space="preserve"> </w:t>
+      </w:r>
+      <w:r>
+        <w:rPr>
+          <w:iCs/>
+          <w:i/>
+        </w:rPr>
         <w:t xml:space="preserve">off-by-one caution (F1/F2) that made the ASO section honest.</w:t>
       </w:r>
       <w:r>
-        <w:t xml:space="preserve"> </w:t>
-      </w:r>
-      <w:r>
+        <w:rPr>
+          <w:iCs/>
+          <w:i/>
+        </w:rPr>
+        <w:t xml:space="preserve"> </w:t>
+      </w:r>
+      <w:r>
+        <w:rPr>
+          <w:iCs/>
+          <w:i/>
+        </w:rPr>
         <w:t xml:space="preserve">-</w:t>
       </w:r>
       <w:r>
-        <w:t xml:space="preserve"> </w:t>
-      </w:r>
-      <w:r>
-        <w:rPr>
-          <w:bCs/>
-          <w:b/>
+        <w:rPr>
+          <w:iCs/>
+          <w:i/>
+        </w:rPr>
+        <w:t xml:space="preserve"> </w:t>
+      </w:r>
+      <w:r>
+        <w:rPr>
+          <w:bCs/>
+          <w:b/>
+          <w:iCs/>
+          <w:i/>
         </w:rPr>
         <w:t xml:space="preserve">E40-SD</w:t>
       </w:r>
       <w:r>
-        <w:t xml:space="preserve"> </w:t>
-      </w:r>
-      <w:r>
+        <w:rPr>
+          <w:iCs/>
+          <w:i/>
+        </w:rPr>
+        <w:t xml:space="preserve"> </w:t>
+      </w:r>
+      <w:r>
+        <w:rPr>
+          <w:iCs/>
+          <w:i/>
+        </w:rPr>
         <w:t xml:space="preserve">evidence/SCOPE_DECISION.md - options, deterministic weighted matrix (O1 = 88.6,</w:t>
       </w:r>
       <w:r>
-        <w:t xml:space="preserve"> </w:t>
-      </w:r>
-      <w:r>
+        <w:rPr>
+          <w:iCs/>
+          <w:i/>
+        </w:rPr>
+        <w:t xml:space="preserve"> </w:t>
+      </w:r>
+      <w:r>
+        <w:rPr>
+          <w:iCs/>
+          <w:i/>
+        </w:rPr>
         <w:t xml:space="preserve">rank-stable under ±20 % weight perturbations), decision log + revisit record.</w:t>
       </w:r>
       <w:r>
-        <w:t xml:space="preserve"> </w:t>
-      </w:r>
-      <w:r>
+        <w:rPr>
+          <w:iCs/>
+          <w:i/>
+        </w:rPr>
+        <w:t xml:space="preserve"> </w:t>
+      </w:r>
+      <w:r>
+        <w:rPr>
+          <w:iCs/>
+          <w:i/>
+        </w:rPr>
         <w:t xml:space="preserve">-</w:t>
       </w:r>
       <w:r>
-        <w:t xml:space="preserve"> </w:t>
-      </w:r>
-      <w:r>
-        <w:rPr>
-          <w:bCs/>
-          <w:b/>
+        <w:rPr>
+          <w:iCs/>
+          <w:i/>
+        </w:rPr>
+        <w:t xml:space="preserve"> </w:t>
+      </w:r>
+      <w:r>
+        <w:rPr>
+          <w:bCs/>
+          <w:b/>
+          <w:iCs/>
+          <w:i/>
         </w:rPr>
         <w:t xml:space="preserve">E41</w:t>
       </w:r>
       <w:r>
-        <w:t xml:space="preserve"> </w:t>
-      </w:r>
-      <w:r>
+        <w:rPr>
+          <w:iCs/>
+          <w:i/>
+        </w:rPr>
+        <w:t xml:space="preserve"> </w:t>
+      </w:r>
+      <w:r>
+        <w:rPr>
+          <w:iCs/>
+          <w:i/>
+        </w:rPr>
         <w:t xml:space="preserve">wave5_ADVERSARIAL_PASS4.md - final independent review returning zero majors</w:t>
       </w:r>
       <w:r>
-        <w:t xml:space="preserve"> </w:t>
-      </w:r>
-      <w:r>
+        <w:rPr>
+          <w:iCs/>
+          <w:i/>
+        </w:rPr>
+        <w:t xml:space="preserve"> </w:t>
+      </w:r>
+      <w:r>
+        <w:rPr>
+          <w:iCs/>
+          <w:i/>
+        </w:rPr>
         <w:t xml:space="preserve">(closure document).</w:t>
       </w:r>
       <w:r>
-        <w:t xml:space="preserve"> </w:t>
-      </w:r>
-      <w:r>
+        <w:rPr>
+          <w:iCs/>
+          <w:i/>
+        </w:rPr>
+        <w:t xml:space="preserve"> </w:t>
+      </w:r>
+      <w:r>
+        <w:rPr>
+          <w:iCs/>
+          <w:i/>
+        </w:rPr>
         <w:t xml:space="preserve">-</w:t>
       </w:r>
       <w:r>
-        <w:t xml:space="preserve"> </w:t>
-      </w:r>
-      <w:r>
-        <w:rPr>
-          <w:bCs/>
-          <w:b/>
+        <w:rPr>
+          <w:iCs/>
+          <w:i/>
+        </w:rPr>
+        <w:t xml:space="preserve"> </w:t>
+      </w:r>
+      <w:r>
+        <w:rPr>
+          <w:bCs/>
+          <w:b/>
+          <w:iCs/>
+          <w:i/>
         </w:rPr>
         <w:t xml:space="preserve">E44</w:t>
       </w:r>
       <w:r>
-        <w:t xml:space="preserve"> </w:t>
-      </w:r>
-      <w:r>
+        <w:rPr>
+          <w:iCs/>
+          <w:i/>
+        </w:rPr>
+        <w:t xml:space="preserve"> </w:t>
+      </w:r>
+      <w:r>
+        <w:rPr>
+          <w:iCs/>
+          <w:i/>
+        </w:rPr>
         <w:t xml:space="preserve">Competition: challenge space https://huggingface.co/spaces/SageBio/rare-disease-real-kid-mva-hackathon-2026</w:t>
       </w:r>
       <w:r>
-        <w:t xml:space="preserve"> </w:t>
-      </w:r>
-      <w:r>
+        <w:rPr>
+          <w:iCs/>
+          <w:i/>
+        </w:rPr>
+        <w:t xml:space="preserve"> </w:t>
+      </w:r>
+      <w:r>
+        <w:rPr>
+          <w:iCs/>
+          <w:i/>
+        </w:rPr>
         <w:t xml:space="preserve">&amp;&amp; dataset https://huggingface.co/datasets/SageBio/mva-hackathon-2026-data · submission</w:t>
       </w:r>
       <w:r>
-        <w:t xml:space="preserve"> </w:t>
-      </w:r>
-      <w:r>
+        <w:rPr>
+          <w:iCs/>
+          <w:i/>
+        </w:rPr>
+        <w:t xml:space="preserve"> </w:t>
+      </w:r>
+      <w:r>
+        <w:rPr>
+          <w:iCs/>
+          <w:i/>
+        </w:rPr>
         <w:t xml:space="preserve">window 2026-08-24 → 2026-10-24, scite partnership terms (per organizer pages).</w:t>
       </w:r>
       <w:r>
-        <w:t xml:space="preserve"> </w:t>
-      </w:r>
-      <w:r>
+        <w:rPr>
+          <w:iCs/>
+          <w:i/>
+        </w:rPr>
+        <w:t xml:space="preserve"> </w:t>
+      </w:r>
+      <w:r>
+        <w:rPr>
+          <w:iCs/>
+          <w:i/>
+        </w:rPr>
         <w:t xml:space="preserve">-</w:t>
       </w:r>
       <w:r>
-        <w:t xml:space="preserve"> </w:t>
-      </w:r>
-      <w:r>
-        <w:rPr>
-          <w:bCs/>
-          <w:b/>
+        <w:rPr>
+          <w:iCs/>
+          <w:i/>
+        </w:rPr>
+        <w:t xml:space="preserve"> </w:t>
+      </w:r>
+      <w:r>
+        <w:rPr>
+          <w:bCs/>
+          <w:b/>
+          <w:iCs/>
+          <w:i/>
         </w:rPr>
         <w:t xml:space="preserve">E44a</w:t>
       </w:r>
       <w:r>
-        <w:t xml:space="preserve"> </w:t>
-      </w:r>
-      <w:r>
+        <w:rPr>
+          <w:iCs/>
+          <w:i/>
+        </w:rPr>
+        <w:t xml:space="preserve"> </w:t>
+      </w:r>
+      <w:r>
+        <w:rPr>
+          <w:iCs/>
+          <w:i/>
+        </w:rPr>
         <w:t xml:space="preserve">Assay #4 specification: evidence/TRACK2_ATTACK_MAP.md §Validation plan; construct details</w:t>
       </w:r>
       <w:r>
-        <w:t xml:space="preserve"> </w:t>
-      </w:r>
-      <w:r>
-        <w:t xml:space="preserve">Δ716-761 + E715G with KARD-boundary caution (wave3_ASOdeep.md §(a)).</w:t>
+        <w:rPr>
+          <w:iCs/>
+          <w:i/>
+        </w:rPr>
+        <w:t xml:space="preserve"> </w:t>
+      </w:r>
+      <w:r>
+        <w:rPr>
+          <w:iCs/>
+          <w:i/>
+        </w:rPr>
+        <w:t xml:space="preserve">-</w:t>
+      </w:r>
+      <w:r>
+        <w:rPr>
+          <w:iCs/>
+          <w:i/>
+        </w:rPr>
+        <w:t xml:space="preserve"> </w:t>
+      </w:r>
+      <w:r>
+        <w:rPr>
+          <w:bCs/>
+          <w:b/>
+          <w:iCs/>
+          <w:i/>
+        </w:rPr>
+        <w:t xml:space="preserve">E73</w:t>
+      </w:r>
+      <w:r>
+        <w:rPr>
+          <w:iCs/>
+          <w:i/>
+        </w:rPr>
+        <w:t xml:space="preserve"> </w:t>
+      </w:r>
+      <w:r>
+        <w:rPr>
+          <w:iCs/>
+          <w:i/>
+        </w:rPr>
+        <w:t xml:space="preserve">MVA Society and Unique,</w:t>
+      </w:r>
+      <w:r>
+        <w:rPr>
+          <w:iCs/>
+          <w:i/>
+        </w:rPr>
+        <w:t xml:space="preserve"> </w:t>
+      </w:r>
+      <w:r>
+        <w:t xml:space="preserve">Mosaic variegated aneuploidy syndrome 1 (BUB1B)* guide, 2026, reviewed by a consultant in clinical and paediatric genetics. Says no clinical practice guidelines exist for this genotype, and recommends abdominal ultrasound every three months plus a blood check every three months to detect leukaemia. A family guide, not a formal guideline. https://mvasociety.org/wp-content/uploads/2026/07/MVA-BUB1B-guide.pdf</w:t>
+      </w:r>
+      <w:r>
+        <w:t xml:space="preserve"> </w:t>
+      </w:r>
+      <w:r>
+        <w:t xml:space="preserve">-</w:t>
+      </w:r>
+      <w:r>
+        <w:t xml:space="preserve"> </w:t>
+      </w:r>
+      <w:r>
+        <w:rPr>
+          <w:bCs/>
+          <w:b/>
+        </w:rPr>
+        <w:t xml:space="preserve">E74</w:t>
+      </w:r>
+      <w:r>
+        <w:t xml:space="preserve"> </w:t>
+      </w:r>
+      <w:r>
+        <w:t xml:space="preserve">Japanese national management handbook for PCS/MVA syndrome, March 2017, Health Labour Sciences Research Grant: schedules abdominal ultrasound and a full blood count at every visit from three months of age into adulthood. https://raredis.nibn.go.jp/malformation/management_guidelines_notebook/32.pdf</w:t>
+      </w:r>
+      <w:r>
+        <w:t xml:space="preserve"> </w:t>
+      </w:r>
+      <w:r>
+        <w:t xml:space="preserve">-</w:t>
+      </w:r>
+      <w:r>
+        <w:t xml:space="preserve"> </w:t>
+      </w:r>
+      <w:r>
+        <w:rPr>
+          <w:bCs/>
+          <w:b/>
+        </w:rPr>
+        <w:t xml:space="preserve">E75</w:t>
+      </w:r>
+      <w:r>
+        <w:t xml:space="preserve"> </w:t>
+      </w:r>
+      <w:r>
+        <w:t xml:space="preserve">Maese et al. 2024,</w:t>
+      </w:r>
+      <w:r>
+        <w:t xml:space="preserve"> </w:t>
+      </w:r>
+      <w:r>
+        <w:rPr>
+          <w:iCs/>
+          <w:i/>
+        </w:rPr>
+        <w:t xml:space="preserve">Clinical Cancer Research</w:t>
+      </w:r>
+      <w:r>
+        <w:t xml:space="preserve">, AACR surveillance update for children predisposed to blood cancers. Cited for a verified absence: its full text names neither this syndrome nor any of its genes. https://doi.org/10.1158/1078-0432.CCR-24-0685</w:t>
+      </w:r>
+      <w:r>
+        <w:t xml:space="preserve"> </w:t>
+      </w:r>
+      <w:r>
+        <w:t xml:space="preserve">-</w:t>
+      </w:r>
+      <w:r>
+        <w:t xml:space="preserve"> </w:t>
+      </w:r>
+      <w:r>
+        <w:rPr>
+          <w:bCs/>
+          <w:b/>
+        </w:rPr>
+        <w:t xml:space="preserve">E76</w:t>
+      </w:r>
+      <w:r>
+        <w:t xml:space="preserve"> </w:t>
+      </w:r>
+      <w:r>
+        <w:t xml:space="preserve">Laberko et al. 2019,</w:t>
+      </w:r>
+      <w:r>
+        <w:t xml:space="preserve"> </w:t>
+      </w:r>
+      <w:r>
+        <w:rPr>
+          <w:iCs/>
+          <w:i/>
+        </w:rPr>
+        <w:t xml:space="preserve">Orphanet Journal of Rare Diseases</w:t>
+      </w:r>
+      <w:r>
+        <w:t xml:space="preserve">, the only reported stem cell transplant in this syndrome, in a child with myelodysplasia and monosomy 7; graft rejection at day +47 and death at day +156. https://doi.org/10.1186/s13023-019-1073-x</w:t>
+      </w:r>
+      <w:r>
+        <w:t xml:space="preserve"> </w:t>
+      </w:r>
+      <w:r>
+        <w:t xml:space="preserve">Δ716-762(+E715G) (p.Glu715_Gly762delinsGly, sequence-derived in evidence/exon_skip/;</w:t>
+      </w:r>
+      <w:r>
+        <w:t xml:space="preserve"> </w:t>
+      </w:r>
+      <w:r>
+        <w:t xml:space="preserve">wave3_ASOdeep.md §(a) is a pre-reconstruction memo and keeps its historical wording).</w:t>
       </w:r>
     </w:p>
     <w:bookmarkEnd w:id="53"/>

</xml_diff>

<commit_message>
Polish disclosure wording and typography
</commit_message>
<xml_diff>
--- a/TRACK2_LAY_REPORT.docx
+++ b/TRACK2_LAY_REPORT.docx
@@ -2308,7 +2308,7 @@
         <w:t xml:space="preserve"> </w:t>
       </w:r>
       <w:r>
-        <w:t xml:space="preserve">used chronically [E23][E23a]. Mechanistically there is a plausible (honestly labeled,</w:t>
+        <w:t xml:space="preserve">used chronically [E23][E23a]. Mechanistically there is a plausible (and we label it</w:t>
       </w:r>
       <w:r>
         <w:t xml:space="preserve"> </w:t>
@@ -3662,13 +3662,13 @@
       </w:r>
     </w:p>
     <w:bookmarkEnd w:id="34"/>
-    <w:bookmarkStart w:id="35" w:name="X2e4b598a872b3edf416436571c443486b528c25"/>
+    <w:bookmarkStart w:id="35" w:name="e.-senolysis---the-mouse-to-child-gap"/>
     <w:p>
       <w:pPr>
         <w:pStyle w:val="Heading3"/>
       </w:pPr>
       <w:r>
-        <w:t xml:space="preserve">5e. Senolysis - the mouse-to-child gap, framed honestly</w:t>
+        <w:t xml:space="preserve">5e. Senolysis - the mouse-to-child gap</w:t>
       </w:r>
     </w:p>
     <w:p>

</xml_diff>

<commit_message>
Fix dangling figure references
</commit_message>
<xml_diff>
--- a/TRACK2_LAY_REPORT.docx
+++ b/TRACK2_LAY_REPORT.docx
@@ -2,7 +2,15 @@
 <file path=word/document.xml><?xml version="1.0" encoding="utf-8"?>
 <w:document xmlns:w="http://schemas.openxmlformats.org/wordprocessingml/2006/main" xmlns:m="http://schemas.openxmlformats.org/officeDocument/2006/math" xmlns:r="http://schemas.openxmlformats.org/officeDocument/2006/relationships" xmlns:o="urn:schemas-microsoft-com:office:office" xmlns:v="urn:schemas-microsoft-com:vml" xmlns:w10="urn:schemas-microsoft-com:office:word" xmlns:a="http://schemas.openxmlformats.org/drawingml/2006/main" xmlns:pic="http://schemas.openxmlformats.org/drawingml/2006/picture" xmlns:wp="http://schemas.openxmlformats.org/drawingml/2006/wordprocessingDrawing">
   <w:body>
-    <w:bookmarkStart w:id="56" w:name="Xa69ee110fbb147ce08efd5b1cb10bee5a1ea1ea"/>
+    <w:p>
+      <w:pPr>
+        <w:pStyle w:val="Title"/>
+      </w:pPr>
+      <w:r>
+        <w:t xml:space="preserve">Track 2 - Lay Report</w:t>
+      </w:r>
+    </w:p>
+    <w:bookmarkStart w:id="53" w:name="Xa69ee110fbb147ce08efd5b1cb10bee5a1ea1ea"/>
     <w:p>
       <w:pPr>
         <w:pStyle w:val="Heading1"/>
@@ -1611,7 +1619,7 @@
         <w:t xml:space="preserve"> </w:t>
       </w:r>
       <w:r>
-        <w:t xml:space="preserve">pre-declared rule (Figure 5) [E41]. In parallel, every load-bearing citation was</w:t>
+        <w:t xml:space="preserve">pre-declared rule [E41]. In parallel, every load-bearing citation was</w:t>
       </w:r>
       <w:r>
         <w:t xml:space="preserve"> </w:t>
@@ -4555,7 +4563,7 @@
         <w:t xml:space="preserve"> </w:t>
       </w:r>
       <w:r>
-        <w:t xml:space="preserve">four adversarial reviews with measured error-decay 8 → 2 → 2 → 0 (Figure 5),</w:t>
+        <w:t xml:space="preserve">four adversarial reviews with measured error-decay 8 → 2 → 2 → 0,</w:t>
       </w:r>
       <w:r>
         <w:t xml:space="preserve"> </w:t>
@@ -4820,7 +4828,7 @@
       </w:r>
     </w:p>
     <w:bookmarkEnd w:id="40"/>
-    <w:bookmarkStart w:id="52" w:name="the-figures-in-one-place"/>
+    <w:bookmarkStart w:id="49" w:name="the-figures-in-one-place"/>
     <w:p>
       <w:pPr>
         <w:pStyle w:val="Heading2"/>
@@ -4941,132 +4949,25 @@
     </w:p>
     <w:p>
       <w:pPr>
-        <w:numPr>
-          <w:ilvl w:val="0"/>
-          <w:numId w:val="1006"/>
-        </w:numPr>
-        <w:pStyle w:val="Compact"/>
-      </w:pPr>
-      <w:r>
-        <w:rPr>
-          <w:bCs/>
-          <w:b/>
-        </w:rPr>
-        <w:t xml:space="preserve">Figure 5</w:t>
-      </w:r>
-      <w:r>
-        <w:t xml:space="preserve"> </w:t>
-      </w:r>
-      <w:r>
-        <w:t xml:space="preserve">- how the evidence was stress-tested (adversarial decay + verification):</w:t>
-      </w:r>
-    </w:p>
-    <w:p>
-      <w:pPr>
         <w:pStyle w:val="FirstParagraph"/>
       </w:pPr>
       <w:r>
         <w:drawing>
           <wp:inline>
-            <wp:extent cx="5334000" cy="2083593"/>
+            <wp:extent cx="5334000" cy="5196205"/>
             <wp:effectExtent b="0" l="0" r="0" t="0"/>
-            <wp:docPr descr="Figure 5 - consensus stress-test" title="" id="44" name="Picture"/>
+            <wp:docPr descr="Figure 1 - where the second mutation sits" title="" id="44" name="Picture"/>
             <a:graphic>
               <a:graphicData uri="http://schemas.openxmlformats.org/drawingml/2006/picture">
                 <pic:pic>
                   <pic:nvPicPr>
-                    <pic:cNvPr descr="figures/F5_consensus_process.png" id="45" name="Picture"/>
+                    <pic:cNvPr descr="figures/F1_variant_structure.png" id="45" name="Picture"/>
                     <pic:cNvPicPr>
                       <a:picLocks noChangeArrowheads="1" noChangeAspect="1"/>
                     </pic:cNvPicPr>
                   </pic:nvPicPr>
                   <pic:blipFill>
                     <a:blip r:embed="rId43"/>
-                    <a:stretch>
-                      <a:fillRect/>
-                    </a:stretch>
-                  </pic:blipFill>
-                  <pic:spPr bwMode="auto">
-                    <a:xfrm>
-                      <a:off x="0" y="0"/>
-                      <a:ext cx="5334000" cy="2083593"/>
-                    </a:xfrm>
-                    <a:prstGeom prst="rect">
-                      <a:avLst/>
-                    </a:prstGeom>
-                    <a:noFill/>
-                    <a:ln w="9525">
-                      <a:noFill/>
-                      <a:headEnd/>
-                      <a:tailEnd/>
-                    </a:ln>
-                  </pic:spPr>
-                </pic:pic>
-              </a:graphicData>
-            </a:graphic>
-          </wp:inline>
-        </w:drawing>
-      </w:r>
-      <w:r>
-        <w:t xml:space="preserve"> </w:t>
-      </w:r>
-      <w:r>
-        <w:rPr>
-          <w:iCs/>
-          <w:i/>
-        </w:rPr>
-        <w:t xml:space="preserve">Figure 5. Left: majors found per independent adversarial pass (the pre-declared stop rule</w:t>
-      </w:r>
-      <w:r>
-        <w:rPr>
-          <w:iCs/>
-          <w:i/>
-        </w:rPr>
-        <w:t xml:space="preserve"> </w:t>
-      </w:r>
-      <w:r>
-        <w:rPr>
-          <w:iCs/>
-          <w:i/>
-        </w:rPr>
-        <w:t xml:space="preserve">met at zero). Right: identifier verification per wave (all sampled sources resolve to real</w:t>
-      </w:r>
-      <w:r>
-        <w:rPr>
-          <w:iCs/>
-          <w:i/>
-        </w:rPr>
-        <w:t xml:space="preserve"> </w:t>
-      </w:r>
-      <w:r>
-        <w:rPr>
-          <w:iCs/>
-          <w:i/>
-        </w:rPr>
-        <w:t xml:space="preserve">papers). Source: evidence/WORKFLOW_CONSENSUS.md changelog.</w:t>
-      </w:r>
-    </w:p>
-    <w:p>
-      <w:pPr>
-        <w:pStyle w:val="BodyText"/>
-      </w:pPr>
-      <w:r>
-        <w:drawing>
-          <wp:inline>
-            <wp:extent cx="5334000" cy="5196205"/>
-            <wp:effectExtent b="0" l="0" r="0" t="0"/>
-            <wp:docPr descr="Figure 1 - where the second mutation sits" title="" id="47" name="Picture"/>
-            <a:graphic>
-              <a:graphicData uri="http://schemas.openxmlformats.org/drawingml/2006/picture">
-                <pic:pic>
-                  <pic:nvPicPr>
-                    <pic:cNvPr descr="figures/F1_variant_structure.png" id="48" name="Picture"/>
-                    <pic:cNvPicPr>
-                      <a:picLocks noChangeArrowheads="1" noChangeAspect="1"/>
-                    </pic:cNvPicPr>
-                  </pic:nvPicPr>
-                  <pic:blipFill>
-                    <a:blip r:embed="rId46"/>
                     <a:stretch>
                       <a:fillRect/>
                     </a:stretch>
@@ -5204,18 +5105,18 @@
           <wp:inline>
             <wp:extent cx="5334000" cy="4606636"/>
             <wp:effectExtent b="0" l="0" r="0" t="0"/>
-            <wp:docPr descr="Figure 2 - the protein map" title="" id="50" name="Picture"/>
+            <wp:docPr descr="Figure 2 - the protein map" title="" id="47" name="Picture"/>
             <a:graphic>
               <a:graphicData uri="http://schemas.openxmlformats.org/drawingml/2006/picture">
                 <pic:pic>
                   <pic:nvPicPr>
-                    <pic:cNvPr descr="figures/F2_BubR1_protein_map.png" id="51" name="Picture"/>
+                    <pic:cNvPr descr="figures/F2_BubR1_protein_map.png" id="48" name="Picture"/>
                     <pic:cNvPicPr>
                       <a:picLocks noChangeArrowheads="1" noChangeAspect="1"/>
                     </pic:cNvPicPr>
                   </pic:nvPicPr>
                   <pic:blipFill>
-                    <a:blip r:embed="rId49"/>
+                    <a:blip r:embed="rId46"/>
                     <a:stretch>
                       <a:fillRect/>
                     </a:stretch>
@@ -5266,8 +5167,8 @@
         <w:t xml:space="preserve">positions, and the 3-D view of the folded core. Source: UniProt O60566 + AlphaFold model.</w:t>
       </w:r>
     </w:p>
-    <w:bookmarkEnd w:id="52"/>
-    <w:bookmarkStart w:id="53" w:name="X92680bee55576af42c189bae15899e146996fb8"/>
+    <w:bookmarkEnd w:id="49"/>
+    <w:bookmarkStart w:id="50" w:name="X92680bee55576af42c189bae15899e146996fb8"/>
     <w:p>
       <w:pPr>
         <w:pStyle w:val="Heading2"/>
@@ -8127,8 +8028,8 @@
         <w:t xml:space="preserve">wave3_ASOdeep.md §(a) is a pre-reconstruction memo and keeps its historical wording).</w:t>
       </w:r>
     </w:p>
-    <w:bookmarkEnd w:id="53"/>
-    <w:bookmarkStart w:id="54" w:name="X74714287373d8ec08f4bb08eb2baf4181a3b203"/>
+    <w:bookmarkEnd w:id="50"/>
+    <w:bookmarkStart w:id="51" w:name="X74714287373d8ec08f4bb08eb2baf4181a3b203"/>
     <w:p>
       <w:pPr>
         <w:pStyle w:val="Heading2"/>
@@ -8763,8 +8664,8 @@
         <w:t xml:space="preserve">- reading the protein-coding, or full, genome of a patient.</w:t>
       </w:r>
     </w:p>
-    <w:bookmarkEnd w:id="54"/>
-    <w:bookmarkStart w:id="55" w:name="provenance-method-and-ai-use-disclosure"/>
+    <w:bookmarkEnd w:id="51"/>
+    <w:bookmarkStart w:id="52" w:name="provenance-method-and-ai-use-disclosure"/>
     <w:p>
       <w:pPr>
         <w:pStyle w:val="Heading2"/>
@@ -9048,8 +8949,8 @@
         <w:t xml:space="preserve">End of report - version 1.1 - post-review integrated draft for human review.</w:t>
       </w:r>
     </w:p>
-    <w:bookmarkEnd w:id="55"/>
-    <w:bookmarkEnd w:id="56"/>
+    <w:bookmarkEnd w:id="52"/>
+    <w:bookmarkEnd w:id="53"/>
     <w:sectPr/>
   </w:body>
 </w:document>

</xml_diff>